<commit_message>
Close weekly SOP run and refresh tracking documents.
Record UL-0007 no_change, map QUAL headings, and rebuild the master workbook and Word pack so the six weekly todos stay inspectable without changing the spoken protocol or n=12.

Co-authored-by: delano2x-Procedurals <delano2x-Procedurals@users.noreply.github.com>
</commit_message>
<xml_diff>
--- a/downloads/Dissertation_Document_Tracking_Pack.docx
+++ b/downloads/Dissertation_Document_Tracking_Pack.docx
@@ -1757,6 +1757,170 @@
                 <w:sz w:val="20"/>
               </w:rPr>
               <w:t>source/originals/ is the instructor trail. Protocol IDs are never reused when retired.</w:t>
+            </w:r>
+          </w:p>
+        </w:tc>
+      </w:tr>
+      <w:tr>
+        <w:tc>
+          <w:tcPr>
+            <w:tcW w:type="dxa" w:w="2340"/>
+          </w:tcPr>
+          <w:p>
+            <w:pPr>
+              <w:spacing w:after="40" w:line="240" w:lineRule="auto"/>
+            </w:pPr>
+            <w:r/>
+            <w:r>
+              <w:rPr>
+                <w:rFonts w:ascii="Times New Roman" w:hAnsi="Times New Roman" w:eastAsia="Times New Roman"/>
+                <w:b w:val="0"/>
+                <w:i w:val="0"/>
+                <w:sz w:val="20"/>
+              </w:rPr>
+              <w:t>CL-0013</w:t>
+            </w:r>
+          </w:p>
+        </w:tc>
+        <w:tc>
+          <w:tcPr>
+            <w:tcW w:type="dxa" w:w="2340"/>
+          </w:tcPr>
+          <w:p>
+            <w:pPr>
+              <w:spacing w:after="40" w:line="240" w:lineRule="auto"/>
+            </w:pPr>
+            <w:r/>
+            <w:r>
+              <w:rPr>
+                <w:rFonts w:ascii="Times New Roman" w:hAnsi="Times New Roman" w:eastAsia="Times New Roman"/>
+                <w:b/>
+                <w:i w:val="0"/>
+                <w:sz w:val="20"/>
+              </w:rPr>
+              <w:t>NEW</w:t>
+            </w:r>
+          </w:p>
+        </w:tc>
+        <w:tc>
+          <w:tcPr>
+            <w:tcW w:type="dxa" w:w="2340"/>
+          </w:tcPr>
+          <w:p>
+            <w:pPr>
+              <w:spacing w:after="40" w:line="240" w:lineRule="auto"/>
+            </w:pPr>
+            <w:r/>
+            <w:r>
+              <w:rPr>
+                <w:rFonts w:ascii="Times New Roman" w:hAnsi="Times New Roman" w:eastAsia="Times New Roman"/>
+                <w:b w:val="0"/>
+                <w:i w:val="0"/>
+                <w:sz w:val="20"/>
+              </w:rPr>
+              <w:t>Weekly SOP run 2026-09-08 executed (six todos). CH3 locks confirmed. Need OV matches chapter-i markdown. Coding not started: type=no_change backup dropped. QUAL Example4-1 headings mapped to lifecycle status.</w:t>
+            </w:r>
+          </w:p>
+        </w:tc>
+        <w:tc>
+          <w:tcPr>
+            <w:tcW w:type="dxa" w:w="2340"/>
+          </w:tcPr>
+          <w:p>
+            <w:pPr>
+              <w:spacing w:after="40" w:line="240" w:lineRule="auto"/>
+            </w:pPr>
+            <w:r/>
+            <w:r>
+              <w:rPr>
+                <w:rFonts w:ascii="Times New Roman" w:hAnsi="Times New Roman" w:eastAsia="Times New Roman"/>
+                <w:b w:val="0"/>
+                <w:i w:val="0"/>
+                <w:sz w:val="20"/>
+              </w:rPr>
+              <w:t>Offering SOP §3.3 requires a weekly close: change log → lifecycle → locks → Need match → nest or no_change → one shareable artifact → QUAL heading status.</w:t>
+            </w:r>
+          </w:p>
+        </w:tc>
+      </w:tr>
+      <w:tr>
+        <w:tc>
+          <w:tcPr>
+            <w:tcW w:type="dxa" w:w="2340"/>
+          </w:tcPr>
+          <w:p>
+            <w:pPr>
+              <w:spacing w:after="40" w:line="240" w:lineRule="auto"/>
+            </w:pPr>
+            <w:r/>
+            <w:r>
+              <w:rPr>
+                <w:rFonts w:ascii="Times New Roman" w:hAnsi="Times New Roman" w:eastAsia="Times New Roman"/>
+                <w:b w:val="0"/>
+                <w:i w:val="0"/>
+                <w:sz w:val="20"/>
+              </w:rPr>
+              <w:t>CL-0014</w:t>
+            </w:r>
+          </w:p>
+        </w:tc>
+        <w:tc>
+          <w:tcPr>
+            <w:tcW w:type="dxa" w:w="2340"/>
+          </w:tcPr>
+          <w:p>
+            <w:pPr>
+              <w:spacing w:after="40" w:line="240" w:lineRule="auto"/>
+            </w:pPr>
+            <w:r/>
+            <w:r>
+              <w:rPr>
+                <w:rFonts w:ascii="Times New Roman" w:hAnsi="Times New Roman" w:eastAsia="Times New Roman"/>
+                <w:b w:val="0"/>
+                <w:i w:val="0"/>
+                <w:sz w:val="20"/>
+              </w:rPr>
+              <w:t>KEEP</w:t>
+            </w:r>
+          </w:p>
+        </w:tc>
+        <w:tc>
+          <w:tcPr>
+            <w:tcW w:type="dxa" w:w="2340"/>
+          </w:tcPr>
+          <w:p>
+            <w:pPr>
+              <w:spacing w:after="40" w:line="240" w:lineRule="auto"/>
+            </w:pPr>
+            <w:r/>
+            <w:r>
+              <w:rPr>
+                <w:rFonts w:ascii="Times New Roman" w:hAnsi="Times New Roman" w:eastAsia="Times New Roman"/>
+                <w:b w:val="0"/>
+                <w:i w:val="0"/>
+                <w:sz w:val="20"/>
+              </w:rPr>
+              <w:t>Parked items remain parked after weekly review. Codebook parents are still STRUCTURAL / FRAMEWORK_DEDUCTIVE / BOUNDARY / EMERGENT (empty). No Foucault, Gioia, or IQ-01 promotion.</w:t>
+            </w:r>
+          </w:p>
+        </w:tc>
+        <w:tc>
+          <w:tcPr>
+            <w:tcW w:type="dxa" w:w="2340"/>
+          </w:tcPr>
+          <w:p>
+            <w:pPr>
+              <w:spacing w:after="40" w:line="240" w:lineRule="auto"/>
+            </w:pPr>
+            <w:r/>
+            <w:r>
+              <w:rPr>
+                <w:rFonts w:ascii="Times New Roman" w:hAnsi="Times New Roman" w:eastAsia="Times New Roman"/>
+                <w:b w:val="0"/>
+                <w:i w:val="0"/>
+                <w:sz w:val="20"/>
+              </w:rPr>
+              <w:t>Success outcome 4: gates honored.</w:t>
             </w:r>
           </w:p>
         </w:tc>
@@ -3805,7 +3969,7 @@
           <w:i w:val="0"/>
           <w:sz w:val="24"/>
         </w:rPr>
-        <w:t>Open README, then 00_CHANGE_LOG (bold rows first), then 09_NEED_OV and 10_WORK_SCHEDULE. Update 01_LIFECYCLE status only. Add literature as a new REF-ID on 03_REFERENCES; do not paste a second bibliography into Word without the ID. After interviews, fill 11_LEVERAGE_MEMO and export Delve to the dated CSV nest. Rebuild this pack with scripts/build_dissertation_tracking_pack.py if CSV templates change.</w:t>
+        <w:t>Open README, then 00_CHANGE_LOG (bold rows first), then 09_NEED_OV and 10_WORK_SCHEDULE. After a weekly SOP close, read 15_WEEKLY_RUN and 16_QUAL_MAP. Update 01_LIFECYCLE status only. Add literature as a new REF-ID on 03_REFERENCES; do not paste a second bibliography into Word without the ID. After interviews, fill 11_LEVERAGE_MEMO and export Delve to the dated CSV nest. Rebuild this pack with scripts/build_dissertation_tracking_pack.py if CSV templates change.</w:t>
       </w:r>
     </w:p>
     <w:p>
@@ -4238,6 +4402,507 @@
         <w:t>Spoken interview wording remains ITDR-GQI-INT-v0.1.1; n = 12; VCST placement on Need only; instructor original Word in source/originals/; phenomenology and confirmatory wording stay out; Delve is not the method.</w:t>
       </w:r>
     </w:p>
+    <w:p>
+      <w:pPr>
+        <w:spacing w:after="160" w:before="240" w:line="480" w:lineRule="auto"/>
+      </w:pPr>
+      <w:r>
+        <w:rPr>
+          <w:rFonts w:ascii="Times New Roman" w:hAnsi="Times New Roman" w:eastAsia="Times New Roman"/>
+          <w:b/>
+          <w:i w:val="0"/>
+          <w:color w:val="9A3412"/>
+          <w:sz w:val="32"/>
+        </w:rPr>
+        <w:t>11. Weekly SOP close — 8 September 2026</w:t>
+      </w:r>
+    </w:p>
+    <w:p>
+      <w:pPr>
+        <w:spacing w:after="120" w:before="0" w:line="480" w:lineRule="auto"/>
+      </w:pPr>
+      <w:r>
+        <w:rPr>
+          <w:rFonts w:ascii="Times New Roman" w:hAnsi="Times New Roman" w:eastAsia="Times New Roman"/>
+          <w:b w:val="0"/>
+          <w:i w:val="0"/>
+          <w:sz w:val="24"/>
+        </w:rPr>
+        <w:t>Offering SOP §3.3 six todos all PASS. Coding had not started, so the nest copy is type=no_change (UL-0007), not a fake Delve export. Shareable memo: downloads/WALKER_Weekly_SOP_Run_2026-09-08.docx.</w:t>
+      </w:r>
+    </w:p>
+    <w:tbl>
+      <w:tblPr>
+        <w:tblStyle w:val="TableGrid"/>
+        <w:tblW w:type="auto" w:w="0"/>
+        <w:jc w:val="center"/>
+        <w:tblLook w:firstColumn="1" w:firstRow="1" w:lastColumn="0" w:lastRow="0" w:noHBand="0" w:noVBand="1" w:val="04A0"/>
+      </w:tblPr>
+      <w:tblGrid>
+        <w:gridCol w:w="3120"/>
+        <w:gridCol w:w="3120"/>
+        <w:gridCol w:w="3120"/>
+      </w:tblGrid>
+      <w:tr>
+        <w:tc>
+          <w:tcPr>
+            <w:tcW w:type="dxa" w:w="3120"/>
+          </w:tcPr>
+          <w:p>
+            <w:pPr>
+              <w:spacing w:after="40" w:line="240" w:lineRule="auto"/>
+            </w:pPr>
+            <w:r/>
+            <w:r>
+              <w:rPr>
+                <w:rFonts w:ascii="Times New Roman" w:hAnsi="Times New Roman" w:eastAsia="Times New Roman"/>
+                <w:b/>
+                <w:i w:val="0"/>
+                <w:sz w:val="20"/>
+              </w:rPr>
+              <w:t>Todo</w:t>
+            </w:r>
+          </w:p>
+        </w:tc>
+        <w:tc>
+          <w:tcPr>
+            <w:tcW w:type="dxa" w:w="3120"/>
+          </w:tcPr>
+          <w:p>
+            <w:pPr>
+              <w:spacing w:after="40" w:line="240" w:lineRule="auto"/>
+            </w:pPr>
+            <w:r/>
+            <w:r>
+              <w:rPr>
+                <w:rFonts w:ascii="Times New Roman" w:hAnsi="Times New Roman" w:eastAsia="Times New Roman"/>
+                <w:b/>
+                <w:i w:val="0"/>
+                <w:sz w:val="20"/>
+              </w:rPr>
+              <w:t>Result</w:t>
+            </w:r>
+          </w:p>
+        </w:tc>
+        <w:tc>
+          <w:tcPr>
+            <w:tcW w:type="dxa" w:w="3120"/>
+          </w:tcPr>
+          <w:p>
+            <w:pPr>
+              <w:spacing w:after="40" w:line="240" w:lineRule="auto"/>
+            </w:pPr>
+            <w:r/>
+            <w:r>
+              <w:rPr>
+                <w:rFonts w:ascii="Times New Roman" w:hAnsi="Times New Roman" w:eastAsia="Times New Roman"/>
+                <w:b/>
+                <w:i w:val="0"/>
+                <w:sz w:val="20"/>
+              </w:rPr>
+              <w:t>Evidence</w:t>
+            </w:r>
+          </w:p>
+        </w:tc>
+      </w:tr>
+      <w:tr>
+        <w:tc>
+          <w:tcPr>
+            <w:tcW w:type="dxa" w:w="3120"/>
+          </w:tcPr>
+          <w:p>
+            <w:pPr>
+              <w:spacing w:after="40" w:line="240" w:lineRule="auto"/>
+            </w:pPr>
+            <w:r/>
+            <w:r>
+              <w:rPr>
+                <w:rFonts w:ascii="Times New Roman" w:hAnsi="Times New Roman" w:eastAsia="Times New Roman"/>
+                <w:b w:val="0"/>
+                <w:i w:val="0"/>
+                <w:sz w:val="20"/>
+              </w:rPr>
+              <w:t>W1 Change log then lifecycle</w:t>
+            </w:r>
+          </w:p>
+        </w:tc>
+        <w:tc>
+          <w:tcPr>
+            <w:tcW w:type="dxa" w:w="3120"/>
+          </w:tcPr>
+          <w:p>
+            <w:pPr>
+              <w:spacing w:after="40" w:line="240" w:lineRule="auto"/>
+            </w:pPr>
+            <w:r/>
+            <w:r>
+              <w:rPr>
+                <w:rFonts w:ascii="Times New Roman" w:hAnsi="Times New Roman" w:eastAsia="Times New Roman"/>
+                <w:b w:val="0"/>
+                <w:i w:val="0"/>
+                <w:sz w:val="20"/>
+              </w:rPr>
+              <w:t>PASS</w:t>
+            </w:r>
+          </w:p>
+        </w:tc>
+        <w:tc>
+          <w:tcPr>
+            <w:tcW w:type="dxa" w:w="3120"/>
+          </w:tcPr>
+          <w:p>
+            <w:pPr>
+              <w:spacing w:after="40" w:line="240" w:lineRule="auto"/>
+            </w:pPr>
+            <w:r/>
+            <w:r>
+              <w:rPr>
+                <w:rFonts w:ascii="Times New Roman" w:hAnsi="Times New Roman" w:eastAsia="Times New Roman"/>
+                <w:b w:val="0"/>
+                <w:i w:val="0"/>
+                <w:sz w:val="20"/>
+              </w:rPr>
+              <w:t>CL-0013/0014; LC-01–04 active/drafted; LC-05–11 not started</w:t>
+            </w:r>
+          </w:p>
+        </w:tc>
+      </w:tr>
+      <w:tr>
+        <w:tc>
+          <w:tcPr>
+            <w:tcW w:type="dxa" w:w="3120"/>
+          </w:tcPr>
+          <w:p>
+            <w:pPr>
+              <w:spacing w:after="40" w:line="240" w:lineRule="auto"/>
+            </w:pPr>
+            <w:r/>
+            <w:r>
+              <w:rPr>
+                <w:rFonts w:ascii="Times New Roman" w:hAnsi="Times New Roman" w:eastAsia="Times New Roman"/>
+                <w:b w:val="0"/>
+                <w:i w:val="0"/>
+                <w:sz w:val="20"/>
+              </w:rPr>
+              <w:t>W2 CH3 locks</w:t>
+            </w:r>
+          </w:p>
+        </w:tc>
+        <w:tc>
+          <w:tcPr>
+            <w:tcW w:type="dxa" w:w="3120"/>
+          </w:tcPr>
+          <w:p>
+            <w:pPr>
+              <w:spacing w:after="40" w:line="240" w:lineRule="auto"/>
+            </w:pPr>
+            <w:r/>
+            <w:r>
+              <w:rPr>
+                <w:rFonts w:ascii="Times New Roman" w:hAnsi="Times New Roman" w:eastAsia="Times New Roman"/>
+                <w:b w:val="0"/>
+                <w:i w:val="0"/>
+                <w:sz w:val="20"/>
+              </w:rPr>
+              <w:t>PASS</w:t>
+            </w:r>
+          </w:p>
+        </w:tc>
+        <w:tc>
+          <w:tcPr>
+            <w:tcW w:type="dxa" w:w="3120"/>
+          </w:tcPr>
+          <w:p>
+            <w:pPr>
+              <w:spacing w:after="40" w:line="240" w:lineRule="auto"/>
+            </w:pPr>
+            <w:r/>
+            <w:r>
+              <w:rPr>
+                <w:rFonts w:ascii="Times New Roman" w:hAnsi="Times New Roman" w:eastAsia="Times New Roman"/>
+                <w:b w:val="0"/>
+                <w:i w:val="0"/>
+                <w:sz w:val="20"/>
+              </w:rPr>
+              <w:t>n = 12; ITDR-GQI-INT-v0.1.1; VCST Need only</w:t>
+            </w:r>
+          </w:p>
+        </w:tc>
+      </w:tr>
+      <w:tr>
+        <w:tc>
+          <w:tcPr>
+            <w:tcW w:type="dxa" w:w="3120"/>
+          </w:tcPr>
+          <w:p>
+            <w:pPr>
+              <w:spacing w:after="40" w:line="240" w:lineRule="auto"/>
+            </w:pPr>
+            <w:r/>
+            <w:r>
+              <w:rPr>
+                <w:rFonts w:ascii="Times New Roman" w:hAnsi="Times New Roman" w:eastAsia="Times New Roman"/>
+                <w:b w:val="0"/>
+                <w:i w:val="0"/>
+                <w:sz w:val="20"/>
+              </w:rPr>
+              <w:t>W3 Need OV vs markdown</w:t>
+            </w:r>
+          </w:p>
+        </w:tc>
+        <w:tc>
+          <w:tcPr>
+            <w:tcW w:type="dxa" w:w="3120"/>
+          </w:tcPr>
+          <w:p>
+            <w:pPr>
+              <w:spacing w:after="40" w:line="240" w:lineRule="auto"/>
+            </w:pPr>
+            <w:r/>
+            <w:r>
+              <w:rPr>
+                <w:rFonts w:ascii="Times New Roman" w:hAnsi="Times New Roman" w:eastAsia="Times New Roman"/>
+                <w:b w:val="0"/>
+                <w:i w:val="0"/>
+                <w:sz w:val="20"/>
+              </w:rPr>
+              <w:t>PASS</w:t>
+            </w:r>
+          </w:p>
+        </w:tc>
+        <w:tc>
+          <w:tcPr>
+            <w:tcW w:type="dxa" w:w="3120"/>
+          </w:tcPr>
+          <w:p>
+            <w:pPr>
+              <w:spacing w:after="40" w:line="240" w:lineRule="auto"/>
+            </w:pPr>
+            <w:r/>
+            <w:r>
+              <w:rPr>
+                <w:rFonts w:ascii="Times New Roman" w:hAnsi="Times New Roman" w:eastAsia="Times New Roman"/>
+                <w:b w:val="0"/>
+                <w:i w:val="0"/>
+                <w:sz w:val="20"/>
+              </w:rPr>
+              <w:t>N-01–N-09 match chapter-i; N-10 confirm</w:t>
+            </w:r>
+          </w:p>
+        </w:tc>
+      </w:tr>
+      <w:tr>
+        <w:tc>
+          <w:tcPr>
+            <w:tcW w:type="dxa" w:w="3120"/>
+          </w:tcPr>
+          <w:p>
+            <w:pPr>
+              <w:spacing w:after="40" w:line="240" w:lineRule="auto"/>
+            </w:pPr>
+            <w:r/>
+            <w:r>
+              <w:rPr>
+                <w:rFonts w:ascii="Times New Roman" w:hAnsi="Times New Roman" w:eastAsia="Times New Roman"/>
+                <w:b w:val="0"/>
+                <w:i w:val="0"/>
+                <w:sz w:val="20"/>
+              </w:rPr>
+              <w:t>W4 Interval or no_change</w:t>
+            </w:r>
+          </w:p>
+        </w:tc>
+        <w:tc>
+          <w:tcPr>
+            <w:tcW w:type="dxa" w:w="3120"/>
+          </w:tcPr>
+          <w:p>
+            <w:pPr>
+              <w:spacing w:after="40" w:line="240" w:lineRule="auto"/>
+            </w:pPr>
+            <w:r/>
+            <w:r>
+              <w:rPr>
+                <w:rFonts w:ascii="Times New Roman" w:hAnsi="Times New Roman" w:eastAsia="Times New Roman"/>
+                <w:b w:val="0"/>
+                <w:i w:val="0"/>
+                <w:sz w:val="20"/>
+              </w:rPr>
+              <w:t>PASS</w:t>
+            </w:r>
+          </w:p>
+        </w:tc>
+        <w:tc>
+          <w:tcPr>
+            <w:tcW w:type="dxa" w:w="3120"/>
+          </w:tcPr>
+          <w:p>
+            <w:pPr>
+              <w:spacing w:after="40" w:line="240" w:lineRule="auto"/>
+            </w:pPr>
+            <w:r/>
+            <w:r>
+              <w:rPr>
+                <w:rFonts w:ascii="Times New Roman" w:hAnsi="Times New Roman" w:eastAsia="Times New Roman"/>
+                <w:b w:val="0"/>
+                <w:i w:val="0"/>
+                <w:sz w:val="20"/>
+              </w:rPr>
+              <w:t>UL-0007; 2026-09-08-weekly/</w:t>
+            </w:r>
+          </w:p>
+        </w:tc>
+      </w:tr>
+      <w:tr>
+        <w:tc>
+          <w:tcPr>
+            <w:tcW w:type="dxa" w:w="3120"/>
+          </w:tcPr>
+          <w:p>
+            <w:pPr>
+              <w:spacing w:after="40" w:line="240" w:lineRule="auto"/>
+            </w:pPr>
+            <w:r/>
+            <w:r>
+              <w:rPr>
+                <w:rFonts w:ascii="Times New Roman" w:hAnsi="Times New Roman" w:eastAsia="Times New Roman"/>
+                <w:b w:val="0"/>
+                <w:i w:val="0"/>
+                <w:sz w:val="20"/>
+              </w:rPr>
+              <w:t>W5 Share one artifact</w:t>
+            </w:r>
+          </w:p>
+        </w:tc>
+        <w:tc>
+          <w:tcPr>
+            <w:tcW w:type="dxa" w:w="3120"/>
+          </w:tcPr>
+          <w:p>
+            <w:pPr>
+              <w:spacing w:after="40" w:line="240" w:lineRule="auto"/>
+            </w:pPr>
+            <w:r/>
+            <w:r>
+              <w:rPr>
+                <w:rFonts w:ascii="Times New Roman" w:hAnsi="Times New Roman" w:eastAsia="Times New Roman"/>
+                <w:b w:val="0"/>
+                <w:i w:val="0"/>
+                <w:sz w:val="20"/>
+              </w:rPr>
+              <w:t>PASS</w:t>
+            </w:r>
+          </w:p>
+        </w:tc>
+        <w:tc>
+          <w:tcPr>
+            <w:tcW w:type="dxa" w:w="3120"/>
+          </w:tcPr>
+          <w:p>
+            <w:pPr>
+              <w:spacing w:after="40" w:line="240" w:lineRule="auto"/>
+            </w:pPr>
+            <w:r/>
+            <w:r>
+              <w:rPr>
+                <w:rFonts w:ascii="Times New Roman" w:hAnsi="Times New Roman" w:eastAsia="Times New Roman"/>
+                <w:b w:val="0"/>
+                <w:i w:val="0"/>
+                <w:sz w:val="20"/>
+              </w:rPr>
+              <w:t>Weekly SOP run Word</w:t>
+            </w:r>
+          </w:p>
+        </w:tc>
+      </w:tr>
+      <w:tr>
+        <w:tc>
+          <w:tcPr>
+            <w:tcW w:type="dxa" w:w="3120"/>
+          </w:tcPr>
+          <w:p>
+            <w:pPr>
+              <w:spacing w:after="40" w:line="240" w:lineRule="auto"/>
+            </w:pPr>
+            <w:r/>
+            <w:r>
+              <w:rPr>
+                <w:rFonts w:ascii="Times New Roman" w:hAnsi="Times New Roman" w:eastAsia="Times New Roman"/>
+                <w:b w:val="0"/>
+                <w:i w:val="0"/>
+                <w:sz w:val="20"/>
+              </w:rPr>
+              <w:t>W6 QUAL Example4-1 map</w:t>
+            </w:r>
+          </w:p>
+        </w:tc>
+        <w:tc>
+          <w:tcPr>
+            <w:tcW w:type="dxa" w:w="3120"/>
+          </w:tcPr>
+          <w:p>
+            <w:pPr>
+              <w:spacing w:after="40" w:line="240" w:lineRule="auto"/>
+            </w:pPr>
+            <w:r/>
+            <w:r>
+              <w:rPr>
+                <w:rFonts w:ascii="Times New Roman" w:hAnsi="Times New Roman" w:eastAsia="Times New Roman"/>
+                <w:b w:val="0"/>
+                <w:i w:val="0"/>
+                <w:sz w:val="20"/>
+              </w:rPr>
+              <w:t>PASS</w:t>
+            </w:r>
+          </w:p>
+        </w:tc>
+        <w:tc>
+          <w:tcPr>
+            <w:tcW w:type="dxa" w:w="3120"/>
+          </w:tcPr>
+          <w:p>
+            <w:pPr>
+              <w:spacing w:after="40" w:line="240" w:lineRule="auto"/>
+            </w:pPr>
+            <w:r/>
+            <w:r>
+              <w:rPr>
+                <w:rFonts w:ascii="Times New Roman" w:hAnsi="Times New Roman" w:eastAsia="Times New Roman"/>
+                <w:b w:val="0"/>
+                <w:i w:val="0"/>
+                <w:sz w:val="20"/>
+              </w:rPr>
+              <w:t>16_QUAL_MAP; IRB/collection/analysis not started</w:t>
+            </w:r>
+          </w:p>
+        </w:tc>
+      </w:tr>
+    </w:tbl>
+    <w:p/>
+    <w:p>
+      <w:pPr>
+        <w:spacing w:after="120" w:before="0" w:line="480" w:lineRule="auto"/>
+      </w:pPr>
+      <w:r>
+        <w:rPr>
+          <w:rFonts w:ascii="Times New Roman" w:hAnsi="Times New Roman" w:eastAsia="Times New Roman"/>
+          <w:b/>
+          <w:i w:val="0"/>
+          <w:color w:val="9A3412"/>
+          <w:sz w:val="24"/>
+        </w:rPr>
+        <w:t xml:space="preserve">Tomorrow’s three tasks: </w:t>
+      </w:r>
+      <w:r>
+        <w:rPr>
+          <w:rFonts w:ascii="Times New Roman" w:hAnsi="Times New Roman" w:eastAsia="Times New Roman"/>
+          <w:b w:val="0"/>
+          <w:i w:val="0"/>
+          <w:sz w:val="24"/>
+        </w:rPr>
+        <w:t>(1) paste the four Need paragraphs into the courseroom Alignment/Need node without stacking a second set; (2) add or verify one Chapter II REF- row with allowed-use; (3) start the IRB packet — no recruitment.</w:t>
+      </w:r>
+    </w:p>
     <w:sectPr>
       <w:headerReference w:type="default" r:id="rId9"/>
       <w:pgSz w:w="12240" w:h="15840"/>

</xml_diff>